<commit_message>
Add an Algoritme-pipeline box to the overview document
A boxed, plain-language walkthrough of the six automated steps that
actually run on the data (classify, connect into lines, match against
topostext, cross-check, self-intersection check, export/draw), tying
the paper's three narrative steps to the concrete pipeline behind them.
</commit_message>
<xml_diff>
--- a/ptolemy_geographica/Saadan_tegner_man_Ptolemaeus_kort.docx
+++ b/ptolemy_geographica/Saadan_tegner_man_Ptolemaeus_kort.docx
@@ -939,6 +939,246 @@
     </w:p>
     <w:p>
       <w:pPr>
+        <w:spacing w:after="240" w:before="100"/>
+      </w:pPr>
+    </w:p>
+    <w:tbl>
+      <w:tblPr>
+        <w:tblW w:type="dxa" w:w="9300"/>
+        <w:tblBorders>
+          <w:top w:val="single" w:color="8FA3B3" w:sz="4"/>
+          <w:left w:val="single" w:color="8FA3B3" w:sz="4"/>
+          <w:bottom w:val="single" w:color="8FA3B3" w:sz="4"/>
+          <w:right w:val="single" w:color="8FA3B3" w:sz="4"/>
+          <w:insideH w:val="single" w:color="auto" w:sz="4"/>
+          <w:insideV w:val="single" w:color="auto" w:sz="4"/>
+        </w:tblBorders>
+      </w:tblPr>
+      <w:tblGrid>
+        <w:gridCol w:w="9300"/>
+      </w:tblGrid>
+      <w:tr>
+        <w:tc>
+          <w:tcPr>
+            <w:tcW w:type="dxa" w:w="9300"/>
+            <w:shd w:fill="EEF2F5" w:color="auto" w:val="clear"/>
+            <w:tcMar>
+              <w:top w:type="dxa" w:w="200"/>
+              <w:left w:type="dxa" w:w="260"/>
+              <w:bottom w:type="dxa" w:w="200"/>
+              <w:right w:type="dxa" w:w="260"/>
+            </w:tcMar>
+          </w:tcPr>
+          <w:p>
+            <w:pPr>
+              <w:spacing w:after="140"/>
+            </w:pPr>
+            <w:r>
+              <w:rPr>
+                <w:rFonts w:ascii="Calibri" w:cs="Calibri" w:eastAsia="Calibri" w:hAnsi="Calibri"/>
+                <w:b/>
+                <w:bCs/>
+                <w:color w:val="1B2733"/>
+                <w:sz w:val="24"/>
+                <w:szCs w:val="24"/>
+              </w:rPr>
+              <w:t xml:space="preserve">Algoritme-pipeline</w:t>
+            </w:r>
+          </w:p>
+          <w:p>
+            <w:pPr>
+              <w:spacing w:after="160" w:line="300"/>
+            </w:pPr>
+            <w:r>
+              <w:rPr>
+                <w:rFonts w:ascii="Calibri" w:cs="Calibri" w:eastAsia="Calibri" w:hAnsi="Calibri"/>
+                <w:i/>
+                <w:iCs/>
+                <w:color w:val="3D4A56"/>
+                <w:sz w:val="21"/>
+                <w:szCs w:val="21"/>
+              </w:rPr>
+              <w:t xml:space="preserve">De tre trin ovenfor er ikke manuelt arbejde hver gang - de køres som en fast række af automatiske programmer, altid i samme rækkefølge, og altid forfra fra bunden når noget rettes:</w:t>
+            </w:r>
+          </w:p>
+          <w:p>
+            <w:pPr>
+              <w:pStyle w:val="ListParagraph"/>
+              <w:numPr>
+                <w:ilvl w:val="0"/>
+                <w:numId w:val="3"/>
+              </w:numPr>
+              <w:spacing w:after="160" w:line="300"/>
+            </w:pPr>
+            <w:r>
+              <w:rPr>
+                <w:rFonts w:ascii="Calibri" w:cs="Calibri" w:eastAsia="Calibri" w:hAnsi="Calibri"/>
+                <w:b/>
+                <w:bCs/>
+                <w:sz w:val="21"/>
+                <w:szCs w:val="21"/>
+              </w:rPr>
+              <w:t xml:space="preserve">Indlæsning og klassificering: </w:t>
+            </w:r>
+            <w:r>
+              <w:rPr>
+                <w:rFonts w:ascii="Calibri" w:cs="Calibri" w:eastAsia="Calibri" w:hAnsi="Calibri"/>
+                <w:sz w:val="21"/>
+                <w:szCs w:val="21"/>
+              </w:rPr>
+              <w:t xml:space="preserve">Hele det rå katalog læses ind, og hvert punkt får sin kategori efter reglerne fra Trin 1 (sektionens overskrift, derefter punktets eget navn).</w:t>
+            </w:r>
+          </w:p>
+          <w:p>
+            <w:pPr>
+              <w:pStyle w:val="ListParagraph"/>
+              <w:numPr>
+                <w:ilvl w:val="0"/>
+                <w:numId w:val="3"/>
+              </w:numPr>
+              <w:spacing w:after="160" w:line="300"/>
+            </w:pPr>
+            <w:r>
+              <w:rPr>
+                <w:rFonts w:ascii="Calibri" w:cs="Calibri" w:eastAsia="Calibri" w:hAnsi="Calibri"/>
+                <w:b/>
+                <w:bCs/>
+                <w:sz w:val="21"/>
+                <w:szCs w:val="21"/>
+              </w:rPr>
+              <w:t xml:space="preserve">Sammenkædning til linjer: </w:t>
+            </w:r>
+            <w:r>
+              <w:rPr>
+                <w:rFonts w:ascii="Calibri" w:cs="Calibri" w:eastAsia="Calibri" w:hAnsi="Calibri"/>
+                <w:sz w:val="21"/>
+                <w:szCs w:val="21"/>
+              </w:rPr>
+              <w:t xml:space="preserve">Punkterne gennemgås i kataloget rækkefølge, og punkter af samme slags kædes sammen til kystlinjer, floder, øer og bjergkæder, som beskrevet i Trin 2 - inklusive de indbyggede regler, der genkender og springer uden om kendte gengangere.</w:t>
+            </w:r>
+          </w:p>
+          <w:p>
+            <w:pPr>
+              <w:pStyle w:val="ListParagraph"/>
+              <w:numPr>
+                <w:ilvl w:val="0"/>
+                <w:numId w:val="3"/>
+              </w:numPr>
+              <w:spacing w:after="160" w:line="300"/>
+            </w:pPr>
+            <w:r>
+              <w:rPr>
+                <w:rFonts w:ascii="Calibri" w:cs="Calibri" w:eastAsia="Calibri" w:hAnsi="Calibri"/>
+                <w:b/>
+                <w:bCs/>
+                <w:sz w:val="21"/>
+                <w:szCs w:val="21"/>
+              </w:rPr>
+              <w:t xml:space="preserve">Matchning mod topostext: </w:t>
+            </w:r>
+            <w:r>
+              <w:rPr>
+                <w:rFonts w:ascii="Calibri" w:cs="Calibri" w:eastAsia="Calibri" w:hAnsi="Calibri"/>
+                <w:sz w:val="21"/>
+                <w:szCs w:val="21"/>
+              </w:rPr>
+              <w:t xml:space="preserve">For hvert punkt findes det bedst passende sted i topostext-oversættelsen, ud fra en kombination af hvor tæt koordinaterne ligger, og hvor ens navnene lyder. Hvert match får en pointscore, så et sikkert fund kan skelnes fra et usikkert gæt.</w:t>
+            </w:r>
+          </w:p>
+          <w:p>
+            <w:pPr>
+              <w:pStyle w:val="ListParagraph"/>
+              <w:numPr>
+                <w:ilvl w:val="0"/>
+                <w:numId w:val="3"/>
+              </w:numPr>
+              <w:spacing w:after="160" w:line="300"/>
+            </w:pPr>
+            <w:r>
+              <w:rPr>
+                <w:rFonts w:ascii="Calibri" w:cs="Calibri" w:eastAsia="Calibri" w:hAnsi="Calibri"/>
+                <w:b/>
+                <w:bCs/>
+                <w:sz w:val="21"/>
+                <w:szCs w:val="21"/>
+              </w:rPr>
+              <w:t xml:space="preserve">Uenighedstjek: </w:t>
+            </w:r>
+            <w:r>
+              <w:rPr>
+                <w:rFonts w:ascii="Calibri" w:cs="Calibri" w:eastAsia="Calibri" w:hAnsi="Calibri"/>
+                <w:sz w:val="21"/>
+                <w:szCs w:val="21"/>
+              </w:rPr>
+              <w:t xml:space="preserve">Datakatalogets kategori for hvert punkt - og for hver hele sektion - holdes op mod, hvad topostexts egen ordlyd antyder. Alle steder de er uenige, bliver listet til nærmere eftersyn, som beskrevet i Trin 3.</w:t>
+            </w:r>
+          </w:p>
+          <w:p>
+            <w:pPr>
+              <w:pStyle w:val="ListParagraph"/>
+              <w:numPr>
+                <w:ilvl w:val="0"/>
+                <w:numId w:val="3"/>
+              </w:numPr>
+              <w:spacing w:after="160" w:line="300"/>
+            </w:pPr>
+            <w:r>
+              <w:rPr>
+                <w:rFonts w:ascii="Calibri" w:cs="Calibri" w:eastAsia="Calibri" w:hAnsi="Calibri"/>
+                <w:b/>
+                <w:bCs/>
+                <w:sz w:val="21"/>
+                <w:szCs w:val="21"/>
+              </w:rPr>
+              <w:t xml:space="preserve">Geometrisk selvtjek: </w:t>
+            </w:r>
+            <w:r>
+              <w:rPr>
+                <w:rFonts w:ascii="Calibri" w:cs="Calibri" w:eastAsia="Calibri" w:hAnsi="Calibri"/>
+                <w:sz w:val="21"/>
+                <w:szCs w:val="21"/>
+              </w:rPr>
+              <w:t xml:space="preserve">Hver optegnet linje undersøges for, om den krydser sig selv nogen steder. En krydsning er næsten altid tegn på, at et punkt ved en fejl er kædet sammen med det forkerte naboprik.</w:t>
+            </w:r>
+          </w:p>
+          <w:p>
+            <w:pPr>
+              <w:pStyle w:val="ListParagraph"/>
+              <w:numPr>
+                <w:ilvl w:val="0"/>
+                <w:numId w:val="3"/>
+              </w:numPr>
+              <w:spacing w:after="160" w:line="300"/>
+            </w:pPr>
+            <w:r>
+              <w:rPr>
+                <w:rFonts w:ascii="Calibri" w:cs="Calibri" w:eastAsia="Calibri" w:hAnsi="Calibri"/>
+                <w:b/>
+                <w:bCs/>
+                <w:sz w:val="21"/>
+                <w:szCs w:val="21"/>
+              </w:rPr>
+              <w:t xml:space="preserve">Eksport og tegning: </w:t>
+            </w:r>
+            <w:r>
+              <w:rPr>
+                <w:rFonts w:ascii="Calibri" w:cs="Calibri" w:eastAsia="Calibri" w:hAnsi="Calibri"/>
+                <w:sz w:val="21"/>
+                <w:szCs w:val="21"/>
+              </w:rPr>
+              <w:t xml:space="preserve">Når rettelserne er på plads, samles det hele til dels et kort til visning, dels en fil der kan åbnes i almindelige geografiske værktøjer (GIS), så resultatet kan efterses visuelt af et menneske.</w:t>
+            </w:r>
+          </w:p>
+        </w:tc>
+      </w:tr>
+    </w:tbl>
+    <w:p>
+      <w:pPr>
+        <w:spacing w:after="0" w:before="240"/>
+      </w:pPr>
+    </w:p>
+    <w:p>
+      <w:pPr>
         <w:pStyle w:val="Heading1"/>
         <w:spacing w:after="160" w:before="320"/>
       </w:pPr>
@@ -1179,6 +1419,18 @@
       </w:pPr>
     </w:lvl>
   </w:abstractNum>
+  <w:abstractNum w:abstractNumId="3" w15:restartNumberingAfterBreak="0">
+    <w:multiLevelType w:val="hybridMultilevel"/>
+    <w:lvl w:ilvl="0" w15:tentative="1">
+      <w:start w:val="1"/>
+      <w:numFmt w:val="decimal"/>
+      <w:lvlText w:val="%1."/>
+      <w:lvlJc w:val="left"/>
+      <w:pPr>
+        <w:ind w:left="420" w:hanging="260"/>
+      </w:pPr>
+    </w:lvl>
+  </w:abstractNum>
   <w:num w:numId="1">
     <w:abstractNumId w:val="1"/>
     <w:lvlOverride w:ilvl="0">
@@ -1187,6 +1439,12 @@
   </w:num>
   <w:num w:numId="2">
     <w:abstractNumId w:val="2"/>
+    <w:lvlOverride w:ilvl="0">
+      <w:startOverride w:val="1"/>
+    </w:lvlOverride>
+  </w:num>
+  <w:num w:numId="3">
+    <w:abstractNumId w:val="3"/>
     <w:lvlOverride w:ilvl="0">
       <w:startOverride w:val="1"/>
     </w:lvlOverride>

</xml_diff>